<commit_message>
Business-ready delivery package and content-driven gates
Add per-template fill guides, fixed product filled Word samples,
draft/gap/storyboard templates, acceptance checklist, content-driven
combo-row rules with tests, and one-shot refresh for tier-A package.
</commit_message>
<xml_diff>
--- a/outputs/业务使用资料包/药店培训内容工厂-业务包/03_填写参考/fuler-fanqiehongsu-product-courseware-4-v1/业务提交_填写参考.docx
+++ b/outputs/业务使用资料包/药店培训内容工厂-业务包/03_填写参考/fuler-fanqiehongsu-product-courseware-4-v1/业务提交_填写参考.docx
@@ -3,114 +3,41 @@
 <w:document xmlns:wpc="http://schemas.microsoft.com/office/word/2010/wordprocessingCanvas" xmlns:mo="http://schemas.microsoft.com/office/mac/office/2008/main" xmlns:mc="http://schemas.openxmlformats.org/markup-compatibility/2006" xmlns:mv="urn:schemas-microsoft-com:mac:vml" xmlns:o="urn:schemas-microsoft-com:office:office" xmlns:r="http://schemas.openxmlformats.org/officeDocument/2006/relationships" xmlns:m="http://schemas.openxmlformats.org/officeDocument/2006/math" xmlns:v="urn:schemas-microsoft-com:vml" xmlns:wp14="http://schemas.microsoft.com/office/word/2010/wordprocessingDrawing" xmlns:wp="http://schemas.openxmlformats.org/drawingml/2006/wordprocessingDrawing" xmlns:w10="urn:schemas-microsoft-com:office:word" xmlns:w="http://schemas.openxmlformats.org/wordprocessingml/2006/main" xmlns:w14="http://schemas.microsoft.com/office/word/2010/wordml" xmlns:wpg="http://schemas.microsoft.com/office/word/2010/wordprocessingGroup" xmlns:wpi="http://schemas.microsoft.com/office/word/2010/wordprocessingInk" xmlns:wne="http://schemas.microsoft.com/office/word/2006/wordml" xmlns:wps="http://schemas.microsoft.com/office/word/2010/wordprocessingShape" mc:Ignorable="w14 wp14">
   <w:body>
     <w:p>
-      <w:pPr>
-        <w:spacing w:after="58"/>
-      </w:pPr>
       <w:r>
-        <w:rPr>
-          <w:rFonts w:ascii="PingFang SC" w:hAnsi="PingFang SC" w:eastAsia="PingFang SC"/>
-          <w:b/>
-          <w:i w:val="0"/>
-          <w:color w:val="1A2026"/>
-          <w:sz w:val="48"/>
-        </w:rPr>
         <w:t>培训课件内容与素材提交</w:t>
-      </w:r>
-    </w:p>
-    <w:p>
-      <w:pPr>
-        <w:pStyle w:val="UniversalIgnore"/>
-      </w:pPr>
-      <w:r>
-        <w:rPr>
-          <w:rFonts w:ascii="PingFang SC" w:hAnsi="PingFang SC" w:eastAsia="PingFang SC"/>
-          <w:b/>
-          <w:i w:val="0"/>
-          <w:color w:val="2E74B5"/>
-          <w:sz w:val="22"/>
-        </w:rPr>
-        <w:t>真实已填样本｜风热证门店培训</w:t>
-      </w:r>
-    </w:p>
-    <w:p>
-      <w:pPr>
-        <w:pStyle w:val="UniversalIgnore"/>
-      </w:pPr>
-      <w:r>
-        <w:rPr>
-          <w:rFonts w:ascii="PingFang SC" w:hAnsi="PingFang SC" w:eastAsia="PingFang SC"/>
-          <w:b w:val="0"/>
-          <w:i w:val="0"/>
-          <w:color w:val="606B76"/>
-          <w:sz w:val="19"/>
-        </w:rPr>
-        <w:t>以下内容取自项目现有内部样本，仅用于展示业务如何整理内容和粘贴素材；新项目投产前仍需完成医学、药事、合规和素材授权审核。</w:t>
       </w:r>
     </w:p>
     <w:p>
       <w:r>
         <w:rPr>
-          <w:rFonts w:ascii="PingFang SC" w:hAnsi="PingFang SC" w:eastAsia="PingFang SC"/>
-          <w:b/>
-          <w:i w:val="0"/>
-          <w:color w:val="1A2026"/>
-          <w:sz w:val="22"/>
+          <w:color w:val="666666"/>
+          <w:sz w:val="20"/>
         </w:rPr>
-        <w:t>课件主题：</w:t>
-      </w:r>
-      <w:r>
-        <w:rPr>
-          <w:rFonts w:ascii="PingFang SC" w:hAnsi="PingFang SC" w:eastAsia="PingFang SC"/>
-          <w:b w:val="0"/>
-          <w:i w:val="0"/>
-          <w:color w:val="1A2026"/>
-          <w:sz w:val="22"/>
-        </w:rPr>
-        <w:t>中医基础知识——风热证</w:t>
+        <w:t>填写参考｜只示范格式。示例医学/价格表述为演示占位，正式主题必须替换为公司审核稿与授权包装。</w:t>
       </w:r>
     </w:p>
     <w:p>
       <w:r>
         <w:rPr>
-          <w:rFonts w:ascii="PingFang SC" w:hAnsi="PingFang SC" w:eastAsia="PingFang SC"/>
-          <w:b/>
-          <w:i w:val="0"/>
-          <w:color w:val="1A2026"/>
-          <w:sz w:val="22"/>
+          <w:color w:val="666666"/>
+          <w:sz w:val="20"/>
         </w:rPr>
-        <w:t>培训对象（可不填）：</w:t>
-      </w:r>
-      <w:r>
-        <w:rPr>
-          <w:rFonts w:ascii="PingFang SC" w:hAnsi="PingFang SC" w:eastAsia="PingFang SC"/>
-          <w:b w:val="0"/>
-          <w:i w:val="0"/>
-          <w:color w:val="1A2026"/>
-          <w:sz w:val="22"/>
-        </w:rPr>
-        <w:t>连锁药店一线员工</w:t>
+        <w:t>联合用药本参考只写 2 组 → 成片必须只出 2 行，禁止空白第三行。</w:t>
       </w:r>
     </w:p>
     <w:p>
       <w:r>
-        <w:rPr>
-          <w:rFonts w:ascii="PingFang SC" w:hAnsi="PingFang SC" w:eastAsia="PingFang SC"/>
-          <w:b/>
-          <w:i w:val="0"/>
-          <w:color w:val="1A2026"/>
-          <w:sz w:val="22"/>
-        </w:rPr>
-        <w:t>培训目标（可不填）：</w:t>
+        <w:t>课件主题：示例商品A（演示用，非正式品规）</w:t>
       </w:r>
+    </w:p>
+    <w:p>
       <w:r>
-        <w:rPr>
-          <w:rFonts w:ascii="PingFang SC" w:hAnsi="PingFang SC" w:eastAsia="PingFang SC"/>
-          <w:b w:val="0"/>
-          <w:i w:val="0"/>
-          <w:color w:val="1A2026"/>
-          <w:sz w:val="22"/>
-        </w:rPr>
-        <w:t>理解风热证的形成与典型表现，掌握基本调理思路和日常注意事项。</w:t>
+        <w:t>培训对象（可不填）：连锁药店门店员工</w:t>
+      </w:r>
+    </w:p>
+    <w:p>
+      <w:r>
+        <w:t>培训目标（可不填）：掌握审核稿中的商品信息与联合推荐话术边界</w:t>
       </w:r>
     </w:p>
     <w:p>
@@ -118,23 +45,32 @@
         <w:pStyle w:val="Heading1"/>
       </w:pPr>
       <w:r>
-        <w:t>什么是风热证</w:t>
+        <w:t>商品介绍</w:t>
       </w:r>
     </w:p>
     <w:p>
-      <w:pPr>
-        <w:keepNext w:val="0"/>
-        <w:keepLines/>
-      </w:pPr>
       <w:r>
-        <w:rPr>
-          <w:rFonts w:ascii="PingFang SC" w:hAnsi="PingFang SC" w:eastAsia="PingFang SC"/>
-          <w:b w:val="0"/>
-          <w:i w:val="0"/>
-          <w:color w:val="1A2026"/>
-          <w:sz w:val="22"/>
-        </w:rPr>
-        <w:t>简单来说，风热证就是风邪和热邪一起侵入身体，导致体表不适、肺气不顺，因此可能出现发热、咽痛、口渴等偏“热”的表现。</w:t>
+        <w:t>主要成分：【待替换为审核原文】</w:t>
+      </w:r>
+    </w:p>
+    <w:p>
+      <w:r>
+        <w:t>功能主治/定位：【待替换为审核原文】</w:t>
+      </w:r>
+    </w:p>
+    <w:p>
+      <w:r>
+        <w:t>用法用量：【待替换为审核原文】</w:t>
+      </w:r>
+    </w:p>
+    <w:p>
+      <w:r>
+        <w:t>【在此处直接粘贴本品授权包装图；没有可删除本行】</w:t>
+      </w:r>
+    </w:p>
+    <w:p>
+      <w:r>
+        <w:t>图片说明／来源（可不填）：公司授权包装</w:t>
       </w:r>
     </w:p>
     <w:p>
@@ -142,135 +78,17 @@
         <w:pStyle w:val="Heading1"/>
       </w:pPr>
       <w:r>
-        <w:t>典型表现</w:t>
+        <w:t>核心卖点</w:t>
       </w:r>
     </w:p>
     <w:p>
-      <w:pPr>
-        <w:keepNext w:val="0"/>
-        <w:keepLines/>
-      </w:pPr>
       <w:r>
-        <w:rPr>
-          <w:rFonts w:ascii="PingFang SC" w:hAnsi="PingFang SC" w:eastAsia="PingFang SC"/>
-          <w:b w:val="0"/>
-          <w:i w:val="0"/>
-          <w:color w:val="1A2026"/>
-          <w:sz w:val="22"/>
-        </w:rPr>
-        <w:t>发热、口渴：身体发热，嘴巴容易觉得干渴，也可能伴有烦躁。</w:t>
+        <w:t>卖点一：【审核表述】</w:t>
       </w:r>
     </w:p>
     <w:p>
-      <w:pPr>
-        <w:keepNext w:val="0"/>
-        <w:keepLines/>
-      </w:pPr>
       <w:r>
-        <w:rPr>
-          <w:rFonts w:ascii="PingFang SC" w:hAnsi="PingFang SC" w:eastAsia="PingFang SC"/>
-          <w:b w:val="0"/>
-          <w:i w:val="0"/>
-          <w:color w:val="1A2026"/>
-          <w:sz w:val="22"/>
-        </w:rPr>
-        <w:t>喉咙肿痛：咽喉红肿疼痛，还可能伴有咳嗽、痰黄或黄稠鼻涕。</w:t>
-      </w:r>
-    </w:p>
-    <w:p>
-      <w:pPr>
-        <w:keepLines/>
-        <w:jc w:val="center"/>
-      </w:pPr>
-      <w:r>
-        <w:drawing>
-          <wp:inline xmlns:a="http://schemas.openxmlformats.org/drawingml/2006/main" xmlns:pic="http://schemas.openxmlformats.org/drawingml/2006/picture">
-            <wp:extent cx="1874519" cy="1874519"/>
-            <wp:docPr id="1" name="Picture 1" descr="发热症状插画" title="发热症状插画"/>
-            <wp:cNvGraphicFramePr>
-              <a:graphicFrameLocks noChangeAspect="1"/>
-            </wp:cNvGraphicFramePr>
-            <a:graphic>
-              <a:graphicData uri="http://schemas.openxmlformats.org/drawingml/2006/picture">
-                <pic:pic>
-                  <pic:nvPicPr>
-                    <pic:cNvPr id="0" name="fever-v1.png"/>
-                    <pic:cNvPicPr/>
-                  </pic:nvPicPr>
-                  <pic:blipFill>
-                    <a:blip r:embed="rId10"/>
-                    <a:stretch>
-                      <a:fillRect/>
-                    </a:stretch>
-                  </pic:blipFill>
-                  <pic:spPr>
-                    <a:xfrm>
-                      <a:off x="0" y="0"/>
-                      <a:ext cx="1874519" cy="1874519"/>
-                    </a:xfrm>
-                    <a:prstGeom prst="rect"/>
-                  </pic:spPr>
-                </pic:pic>
-              </a:graphicData>
-            </a:graphic>
-          </wp:inline>
-        </w:drawing>
-      </w:r>
-      <w:r>
-        <w:t xml:space="preserve">  </w:t>
-      </w:r>
-      <w:r>
-        <w:drawing>
-          <wp:inline xmlns:a="http://schemas.openxmlformats.org/drawingml/2006/main" xmlns:pic="http://schemas.openxmlformats.org/drawingml/2006/picture">
-            <wp:extent cx="1874519" cy="1874519"/>
-            <wp:docPr id="2" name="Picture 2" descr="喉咙肿痛症状插画" title="喉咙肿痛症状插画"/>
-            <wp:cNvGraphicFramePr>
-              <a:graphicFrameLocks noChangeAspect="1"/>
-            </wp:cNvGraphicFramePr>
-            <a:graphic>
-              <a:graphicData uri="http://schemas.openxmlformats.org/drawingml/2006/picture">
-                <pic:pic>
-                  <pic:nvPicPr>
-                    <pic:cNvPr id="0" name="sore-throat-v1.png"/>
-                    <pic:cNvPicPr/>
-                  </pic:nvPicPr>
-                  <pic:blipFill>
-                    <a:blip r:embed="rId11"/>
-                    <a:stretch>
-                      <a:fillRect/>
-                    </a:stretch>
-                  </pic:blipFill>
-                  <pic:spPr>
-                    <a:xfrm>
-                      <a:off x="0" y="0"/>
-                      <a:ext cx="1874519" cy="1874519"/>
-                    </a:xfrm>
-                    <a:prstGeom prst="rect"/>
-                  </pic:spPr>
-                </pic:pic>
-              </a:graphicData>
-            </a:graphic>
-          </wp:inline>
-        </w:drawing>
-      </w:r>
-      <w:r>
-        <w:t xml:space="preserve">  </w:t>
-      </w:r>
-    </w:p>
-    <w:p>
-      <w:pPr>
-        <w:keepNext w:val="0"/>
-        <w:jc w:val="center"/>
-      </w:pPr>
-      <w:r>
-        <w:rPr>
-          <w:rFonts w:ascii="PingFang SC" w:hAnsi="PingFang SC" w:eastAsia="PingFang SC"/>
-          <w:b w:val="0"/>
-          <w:i/>
-          <w:color w:val="606B76"/>
-          <w:sz w:val="18"/>
-        </w:rPr>
-        <w:t>图片说明／来源：从左至右：发热、喉咙肿痛；项目内原创素材 symptom.fever、symptom.sore-throat</w:t>
+        <w:t>卖点二：【审核表述】</w:t>
       </w:r>
     </w:p>
     <w:p>
@@ -278,55 +96,17 @@
         <w:pStyle w:val="Heading1"/>
       </w:pPr>
       <w:r>
-        <w:t>调理思路</w:t>
+        <w:t>适宜人群</w:t>
       </w:r>
     </w:p>
     <w:p>
-      <w:pPr>
-        <w:keepNext w:val="0"/>
-        <w:keepLines/>
-      </w:pPr>
       <w:r>
-        <w:rPr>
-          <w:rFonts w:ascii="PingFang SC" w:hAnsi="PingFang SC" w:eastAsia="PingFang SC"/>
-          <w:b w:val="0"/>
-          <w:i w:val="0"/>
-          <w:color w:val="1A2026"/>
-          <w:sz w:val="22"/>
-        </w:rPr>
-        <w:t>核心思路是疏风清热。</w:t>
+        <w:t>人群一：【审核表述】</w:t>
       </w:r>
     </w:p>
     <w:p>
-      <w:pPr>
-        <w:keepNext w:val="0"/>
-        <w:keepLines/>
-      </w:pPr>
       <w:r>
-        <w:rPr>
-          <w:rFonts w:ascii="PingFang SC" w:hAnsi="PingFang SC" w:eastAsia="PingFang SC"/>
-          <w:b w:val="0"/>
-          <w:i w:val="0"/>
-          <w:color w:val="1A2026"/>
-          <w:sz w:val="22"/>
-        </w:rPr>
-        <w:t>日常可选用桑叶、菊花、薄荷等内容进行知识讲解；涉及用量或饮用方法时，应以公司审核终稿为准。</w:t>
-      </w:r>
-    </w:p>
-    <w:p>
-      <w:pPr>
-        <w:keepNext w:val="0"/>
-        <w:keepLines/>
-      </w:pPr>
-      <w:r>
-        <w:rPr>
-          <w:rFonts w:ascii="PingFang SC" w:hAnsi="PingFang SC" w:eastAsia="PingFang SC"/>
-          <w:b w:val="0"/>
-          <w:i w:val="0"/>
-          <w:color w:val="1A2026"/>
-          <w:sz w:val="22"/>
-        </w:rPr>
-        <w:t>如需展示药品名称或包装，应同时提交公司审核文案和授权包装原图；未提供时不展示包装。</w:t>
+        <w:t>人群二：【审核表述】</w:t>
       </w:r>
     </w:p>
     <w:p>
@@ -334,71 +114,22 @@
         <w:pStyle w:val="Heading1"/>
       </w:pPr>
       <w:r>
-        <w:t>日常注意事项</w:t>
+        <w:t>联合用药话术</w:t>
       </w:r>
     </w:p>
     <w:p>
-      <w:pPr>
-        <w:keepNext w:val="0"/>
-        <w:keepLines/>
-      </w:pPr>
       <w:r>
-        <w:rPr>
-          <w:rFonts w:ascii="PingFang SC" w:hAnsi="PingFang SC" w:eastAsia="PingFang SC"/>
-          <w:b w:val="0"/>
-          <w:i w:val="0"/>
-          <w:color w:val="1A2026"/>
-          <w:sz w:val="22"/>
-        </w:rPr>
-        <w:t>房间适当开窗通风，保持空气流通。</w:t>
+        <w:t>方案 1｜场景：【场景甲】｜组合：示例商品A + 搭档甲｜话术：【审核话术甲】</w:t>
       </w:r>
     </w:p>
     <w:p>
-      <w:pPr>
-        <w:keepNext w:val="0"/>
-        <w:keepLines/>
-      </w:pPr>
       <w:r>
-        <w:rPr>
-          <w:rFonts w:ascii="PingFang SC" w:hAnsi="PingFang SC" w:eastAsia="PingFang SC"/>
-          <w:b w:val="0"/>
-          <w:i w:val="0"/>
-          <w:color w:val="1A2026"/>
-          <w:sz w:val="22"/>
-        </w:rPr>
-        <w:t>少量多次饮用温水，注意补充水分。</w:t>
+        <w:t>方案 2｜场景：【场景乙】｜组合：示例商品A + 搭档乙｜话术：【审核话术乙】</w:t>
       </w:r>
     </w:p>
     <w:p>
-      <w:pPr>
-        <w:keepNext w:val="0"/>
-        <w:keepLines/>
-      </w:pPr>
       <w:r>
-        <w:rPr>
-          <w:rFonts w:ascii="PingFang SC" w:hAnsi="PingFang SC" w:eastAsia="PingFang SC"/>
-          <w:b w:val="0"/>
-          <w:i w:val="0"/>
-          <w:color w:val="1A2026"/>
-          <w:sz w:val="22"/>
-        </w:rPr>
-        <w:t>饮食以清淡为主，少吃辛辣、油炸和燥热食物。</w:t>
-      </w:r>
-    </w:p>
-    <w:p>
-      <w:pPr>
-        <w:keepNext w:val="0"/>
-        <w:keepLines/>
-      </w:pPr>
-      <w:r>
-        <w:rPr>
-          <w:rFonts w:ascii="PingFang SC" w:hAnsi="PingFang SC" w:eastAsia="PingFang SC"/>
-          <w:b w:val="0"/>
-          <w:i w:val="0"/>
-          <w:color w:val="1A2026"/>
-          <w:sz w:val="22"/>
-        </w:rPr>
-        <w:t>暂时避免烟酒，并保证充足休息。</w:t>
+        <w:t>【可粘贴搭档包装图；无图删除本行】</w:t>
       </w:r>
     </w:p>
     <w:p>
@@ -406,67 +137,22 @@
         <w:pStyle w:val="Heading1"/>
       </w:pPr>
       <w:r>
-        <w:t>课程小结</w:t>
+        <w:t>注意事项</w:t>
       </w:r>
     </w:p>
     <w:p>
-      <w:pPr>
-        <w:keepNext w:val="0"/>
-        <w:keepLines/>
-      </w:pPr>
       <w:r>
-        <w:rPr>
-          <w:rFonts w:ascii="PingFang SC" w:hAnsi="PingFang SC" w:eastAsia="PingFang SC"/>
-          <w:b w:val="0"/>
-          <w:i w:val="0"/>
-          <w:color w:val="1A2026"/>
-          <w:sz w:val="22"/>
-        </w:rPr>
-        <w:t>风热证的学习重点可以概括为：病因看“风邪＋热邪”，表现看“发热、口渴、咽痛等偏热症状”，调理把握“疏风清热”，生活中注意通风、补水、清淡饮食和休息。</w:t>
+        <w:t>【说明书或审核注意事项；没有整节可删】</w:t>
       </w:r>
     </w:p>
     <w:sectPr>
-      <w:footerReference w:type="default" r:id="rId9"/>
       <w:pgSz w:w="12240" w:h="15840"/>
-      <w:pgMar w:top="1440" w:right="1440" w:bottom="1440" w:left="1440" w:header="708" w:footer="708" w:gutter="0"/>
+      <w:pgMar w:top="1440" w:right="1800" w:bottom="1440" w:left="1800" w:header="720" w:footer="720" w:gutter="0"/>
       <w:cols w:space="720"/>
       <w:docGrid w:linePitch="360"/>
     </w:sectPr>
   </w:body>
 </w:document>
-</file>
-
-<file path=word/footer1.xml><?xml version="1.0" encoding="utf-8"?>
-<w:ftr xmlns:m="http://schemas.openxmlformats.org/officeDocument/2006/math" xmlns:mc="http://schemas.openxmlformats.org/markup-compatibility/2006" xmlns:mo="http://schemas.microsoft.com/office/mac/office/2008/main" xmlns:mv="urn:schemas-microsoft-com:mac:vml" xmlns:o="urn:schemas-microsoft-com:office:office" xmlns:r="http://schemas.openxmlformats.org/officeDocument/2006/relationships" xmlns:v="urn:schemas-microsoft-com:vml" xmlns:w10="urn:schemas-microsoft-com:office:word" xmlns:w14="http://schemas.microsoft.com/office/word/2010/wordml" xmlns:w="http://schemas.openxmlformats.org/wordprocessingml/2006/main" xmlns:wne="http://schemas.microsoft.com/office/word/2006/wordml" xmlns:wp14="http://schemas.microsoft.com/office/word/2010/wordprocessingDrawing" xmlns:wp="http://schemas.openxmlformats.org/drawingml/2006/wordprocessingDrawing" xmlns:wpc="http://schemas.microsoft.com/office/word/2010/wordprocessingCanvas" xmlns:wpg="http://schemas.microsoft.com/office/word/2010/wordprocessingGroup" xmlns:wpi="http://schemas.microsoft.com/office/word/2010/wordprocessingInk" xmlns:wps="http://schemas.microsoft.com/office/word/2010/wordprocessingShape" mc:Ignorable="w14 wp14">
-  <w:p>
-    <w:pPr>
-      <w:pStyle w:val="Footer"/>
-      <w:jc w:val="right"/>
-    </w:pPr>
-    <w:r>
-      <w:rPr>
-        <w:rFonts w:ascii="PingFang SC" w:hAnsi="PingFang SC" w:eastAsia="PingFang SC"/>
-        <w:b w:val="0"/>
-        <w:i w:val="0"/>
-        <w:color w:val="606B76"/>
-        <w:sz w:val="18"/>
-      </w:rPr>
-      <w:t>一份 Word 对应一个课件主题｜</w:t>
-    </w:r>
-    <w:r>
-      <w:rPr>
-        <w:rFonts w:ascii="PingFang SC" w:hAnsi="PingFang SC" w:eastAsia="PingFang SC"/>
-        <w:b w:val="0"/>
-        <w:i w:val="0"/>
-        <w:color w:val="606B76"/>
-        <w:sz w:val="18"/>
-      </w:rPr>
-      <w:fldChar w:fldCharType="begin"/>
-      <w:instrText xml:space="preserve"> PAGE </w:instrText>
-      <w:fldChar w:fldCharType="end"/>
-    </w:r>
-  </w:p>
-</w:ftr>
 </file>
 
 <file path=word/numbering.xml><?xml version="1.0" encoding="utf-8"?>
@@ -832,14 +518,6 @@
     <w:name w:val="Normal"/>
     <w:qFormat/>
     <w:rsid w:val="00FC693F"/>
-    <w:pPr>
-      <w:spacing w:after="120" w:line="300" w:lineRule="auto"/>
-    </w:pPr>
-    <w:rPr>
-      <w:rFonts w:ascii="PingFang SC" w:hAnsi="PingFang SC" w:eastAsia="PingFang SC"/>
-      <w:color w:val="1A2026"/>
-      <w:sz w:val="22"/>
-    </w:rPr>
   </w:style>
   <w:style w:type="paragraph" w:styleId="Header">
     <w:name w:val="header"/>
@@ -896,15 +574,15 @@
     <w:pPr>
       <w:keepNext/>
       <w:keepLines/>
-      <w:spacing w:before="360" w:after="200"/>
+      <w:spacing w:before="480" w:after="0"/>
       <w:outlineLvl w:val="0"/>
     </w:pPr>
     <w:rPr>
-      <w:rFonts w:asciiTheme="majorHAnsi" w:eastAsiaTheme="majorEastAsia" w:hAnsiTheme="majorHAnsi" w:cstheme="majorBidi" w:ascii="PingFang SC" w:hAnsi="PingFang SC" w:eastAsia="PingFang SC"/>
+      <w:rFonts w:asciiTheme="majorHAnsi" w:eastAsiaTheme="majorEastAsia" w:hAnsiTheme="majorHAnsi" w:cstheme="majorBidi"/>
       <w:b/>
       <w:bCs/>
-      <w:color w:val="2E74B5"/>
-      <w:sz w:val="32"/>
+      <w:color w:val="365F91" w:themeColor="accent1" w:themeShade="BF"/>
+      <w:sz w:val="28"/>
       <w:szCs w:val="28"/>
     </w:rPr>
   </w:style>
@@ -12522,18 +12200,6 @@
         <w:shd w:val="clear" w:color="auto" w:fill="FBCAA2" w:themeFill="accent6" w:themeFillTint="7F"/>
       </w:tcPr>
     </w:tblStylePr>
-  </w:style>
-  <w:style w:type="paragraph" w:customStyle="1" w:styleId="UniversalIgnore">
-    <w:name w:val="Universal Ignore"/>
-    <w:basedOn w:val="Normal"/>
-    <w:pPr>
-      <w:spacing w:after="100" w:line="300" w:lineRule="auto"/>
-    </w:pPr>
-    <w:rPr>
-      <w:rFonts w:ascii="PingFang SC" w:hAnsi="PingFang SC" w:eastAsia="PingFang SC"/>
-      <w:color w:val="606B76"/>
-      <w:sz w:val="19"/>
-    </w:rPr>
   </w:style>
 </w:styles>
 </file>

</xml_diff>